<commit_message>
Rework gameplay resume, add Software Engineer resume and generator
- Gameplay resume: drop "Senior", show 2024-2025 relocation, add scale
  facts, store links, Beauty Tycoon, Unity keywords; compress early work.
- New Software Engineer (C#, .NET) resume with Cedar Clerk.
- tools/resume-gen: PDF/DOCX generator from the Markdown source.
- README links both resumes; AGENTS, HANDOFF, INBOX for agent sessions.
- .gitignore: _Private, .DS_Store, node_modules.

Co-Authored-By: Claude Opus 5.5 <noreply@anthropic.com>
</commit_message>
<xml_diff>
--- a/Resume_Gameplay_Engineer.docx
+++ b/Resume_Gameplay_Engineer.docx
@@ -29,7 +29,7 @@
           <w:sz w:val="26"/>
           <w:szCs w:val="26"/>
         </w:rPr>
-        <w:t xml:space="preserve">Senior Unity Gameplay Engineer</w:t>
+        <w:t xml:space="preserve">Unity Gameplay Engineer</w:t>
       </w:r>
     </w:p>
     <w:p>
@@ -45,7 +45,7 @@
         </w:rPr>
         <w:t xml:space="preserve">Portland, OR  ·  </w:t>
       </w:r>
-      <w:hyperlink w:history="1" r:id="rIdyjed9ut1taloi5k-wcxlf">
+      <w:hyperlink w:history="1" r:id="rId5jeuwywhtnhwu5co1uyl_">
         <w:r>
           <w:rPr>
             <w:rStyle w:val="Hyperlink"/>
@@ -66,7 +66,7 @@
         </w:rPr>
         <w:t xml:space="preserve">  ·  </w:t>
       </w:r>
-      <w:hyperlink w:history="1" r:id="rIdw14xm7dje5maejb2wkmej">
+      <w:hyperlink w:history="1" r:id="rIdmglskvbtml4uprrhy0v37">
         <w:r>
           <w:rPr>
             <w:rStyle w:val="Hyperlink"/>
@@ -78,6 +78,27 @@
           <w:t xml:space="preserve">linkedin.com/in/vchudaev</w:t>
         </w:r>
       </w:hyperlink>
+      <w:r>
+        <w:rPr>
+          <w:rFonts w:ascii="Calibri" w:cs="Calibri" w:eastAsia="Calibri" w:hAnsi="Calibri"/>
+          <w:color w:val="4b5563"/>
+          <w:sz w:val="21"/>
+          <w:szCs w:val="21"/>
+        </w:rPr>
+        <w:t xml:space="preserve">  ·  </w:t>
+      </w:r>
+      <w:hyperlink w:history="1" r:id="rIdcesowvenm24gjtwwbraak">
+        <w:r>
+          <w:rPr>
+            <w:rStyle w:val="Hyperlink"/>
+            <w:rFonts w:ascii="Calibri" w:cs="Calibri" w:eastAsia="Calibri" w:hAnsi="Calibri"/>
+            <w:color w:val="4b5563"/>
+            <w:sz w:val="21"/>
+            <w:szCs w:val="21"/>
+          </w:rPr>
+          <w:t xml:space="preserve">github.com/martycow</w:t>
+        </w:r>
+      </w:hyperlink>
     </w:p>
     <w:p>
       <w:pPr>
@@ -136,16 +157,36 @@
           <w:sz w:val="21"/>
           <w:szCs w:val="21"/>
         </w:rPr>
-        <w:t xml:space="preserve">11 years of software development experience</w:t>
-      </w:r>
-      <w:r>
-        <w:rPr>
-          <w:rFonts w:ascii="Calibri" w:cs="Calibri" w:eastAsia="Calibri" w:hAnsi="Calibri"/>
-          <w:color w:val="1f2937"/>
-          <w:sz w:val="21"/>
-          <w:szCs w:val="21"/>
-        </w:rPr>
-        <w:t xml:space="preserve">. Builds gameplay systems, multiplayer features and designer tools for mobile and PC/MMO projects, from prototype to live operations. </w:t>
+        <w:t xml:space="preserve">10+ years of software development</w:t>
+      </w:r>
+      <w:r>
+        <w:rPr>
+          <w:rFonts w:ascii="Calibri" w:cs="Calibri" w:eastAsia="Calibri" w:hAnsi="Calibri"/>
+          <w:color w:val="1f2937"/>
+          <w:sz w:val="21"/>
+          <w:szCs w:val="21"/>
+        </w:rPr>
+        <w:t xml:space="preserve"> and 7+ years in Unity. Built features for live mobile games with </w:t>
+      </w:r>
+      <w:r>
+        <w:rPr>
+          <w:rFonts w:ascii="Calibri" w:cs="Calibri" w:eastAsia="Calibri" w:hAnsi="Calibri"/>
+          <w:b/>
+          <w:bCs/>
+          <w:color w:val="1f2937"/>
+          <w:sz w:val="21"/>
+          <w:szCs w:val="21"/>
+        </w:rPr>
+        <w:t xml:space="preserve">50M+ and 1M+ downloads</w:t>
+      </w:r>
+      <w:r>
+        <w:rPr>
+          <w:rFonts w:ascii="Calibri" w:cs="Calibri" w:eastAsia="Calibri" w:hAnsi="Calibri"/>
+          <w:color w:val="1f2937"/>
+          <w:sz w:val="21"/>
+          <w:szCs w:val="21"/>
+        </w:rPr>
+        <w:t xml:space="preserve"> and for a PC MMORPG in Steam Early Access. </w:t>
       </w:r>
       <w:r>
         <w:rPr>
@@ -165,7 +206,7 @@
           <w:sz w:val="21"/>
           <w:szCs w:val="21"/>
         </w:rPr>
-        <w:t xml:space="preserve"> on a live title, successfully developed projects from scratch and led a four-developer team. Passionate about UI, gameplay systems and tools.</w:t>
+        <w:t xml:space="preserve"> on a live title by reworking its offers system and led a team of four programmers. Strongest in gameplay systems, UI and designer tools.</w:t>
       </w:r>
     </w:p>
     <w:p>
@@ -211,7 +252,7 @@
           <w:sz w:val="21"/>
           <w:szCs w:val="21"/>
         </w:rPr>
-        <w:t xml:space="preserve">C#, Unity, SOLID, ECS</w:t>
+        <w:t xml:space="preserve">C#, Unity, Zenject (DI), UniTask, Addressables, ECS</w:t>
       </w:r>
     </w:p>
     <w:p>
@@ -236,7 +277,7 @@
           <w:sz w:val="21"/>
           <w:szCs w:val="21"/>
         </w:rPr>
-        <w:t xml:space="preserve">Core &amp; meta gameplay, abilities, UI, behavior-tree AI, NPCs, multiplayer, network sync, tools</w:t>
+        <w:t xml:space="preserve">Core and meta gameplay, combat, abilities, behavior-tree AI, NPCs, character customization</w:t>
       </w:r>
     </w:p>
     <w:p>
@@ -252,6 +293,81 @@
           <w:sz w:val="21"/>
           <w:szCs w:val="21"/>
         </w:rPr>
+        <w:t xml:space="preserve">Multiplayer: </w:t>
+      </w:r>
+      <w:r>
+        <w:rPr>
+          <w:rFonts w:ascii="Calibri" w:cs="Calibri" w:eastAsia="Calibri" w:hAnsi="Calibri"/>
+          <w:color w:val="1f2937"/>
+          <w:sz w:val="21"/>
+          <w:szCs w:val="21"/>
+        </w:rPr>
+        <w:t xml:space="preserve">Photon, network synchronization, client-server architecture</w:t>
+      </w:r>
+    </w:p>
+    <w:p>
+      <w:pPr>
+        <w:spacing w:after="20"/>
+      </w:pPr>
+      <w:r>
+        <w:rPr>
+          <w:rFonts w:ascii="Calibri" w:cs="Calibri" w:eastAsia="Calibri" w:hAnsi="Calibri"/>
+          <w:b/>
+          <w:bCs/>
+          <w:color w:val="1e3a5f"/>
+          <w:sz w:val="21"/>
+          <w:szCs w:val="21"/>
+        </w:rPr>
+        <w:t xml:space="preserve">UI: </w:t>
+      </w:r>
+      <w:r>
+        <w:rPr>
+          <w:rFonts w:ascii="Calibri" w:cs="Calibri" w:eastAsia="Calibri" w:hAnsi="Calibri"/>
+          <w:color w:val="1f2937"/>
+          <w:sz w:val="21"/>
+          <w:szCs w:val="21"/>
+        </w:rPr>
+        <w:t xml:space="preserve">UGUI, NGUI, adaptive and responsive layouts, pixel-perfect implementation</w:t>
+      </w:r>
+    </w:p>
+    <w:p>
+      <w:pPr>
+        <w:spacing w:after="20"/>
+      </w:pPr>
+      <w:r>
+        <w:rPr>
+          <w:rFonts w:ascii="Calibri" w:cs="Calibri" w:eastAsia="Calibri" w:hAnsi="Calibri"/>
+          <w:b/>
+          <w:bCs/>
+          <w:color w:val="1e3a5f"/>
+          <w:sz w:val="21"/>
+          <w:szCs w:val="21"/>
+        </w:rPr>
+        <w:t xml:space="preserve">Tools: </w:t>
+      </w:r>
+      <w:r>
+        <w:rPr>
+          <w:rFonts w:ascii="Calibri" w:cs="Calibri" w:eastAsia="Calibri" w:hAnsi="Calibri"/>
+          <w:color w:val="1f2937"/>
+          <w:sz w:val="21"/>
+          <w:szCs w:val="21"/>
+        </w:rPr>
+        <w:t xml:space="preserve">Unity editor extensions (custom inspectors, scene gizmos), node-graph editors, designer tools</w:t>
+      </w:r>
+    </w:p>
+    <w:p>
+      <w:pPr>
+        <w:spacing w:after="20"/>
+      </w:pPr>
+      <w:r>
+        <w:rPr>
+          <w:rFonts w:ascii="Calibri" w:cs="Calibri" w:eastAsia="Calibri" w:hAnsi="Calibri"/>
+          <w:b/>
+          <w:bCs/>
+          <w:color w:val="1e3a5f"/>
+          <w:sz w:val="21"/>
+          <w:szCs w:val="21"/>
+        </w:rPr>
         <w:t xml:space="preserve">Live operations: </w:t>
       </w:r>
       <w:r>
@@ -261,7 +377,7 @@
           <w:sz w:val="21"/>
           <w:szCs w:val="21"/>
         </w:rPr>
-        <w:t xml:space="preserve">Unity IAP, IronSource, AdMob, AppsFlyer, Firebase, CI/CD, iOS &amp; Android releases</w:t>
+        <w:t xml:space="preserve">Unity IAP, IronSource, AdMob, AppsFlyer, Firebase, remote config, CI/CD, iOS/Android releases</w:t>
       </w:r>
     </w:p>
     <w:p>
@@ -286,7 +402,7 @@
           <w:sz w:val="21"/>
           <w:szCs w:val="21"/>
         </w:rPr>
-        <w:t xml:space="preserve">Unity Profiler, Xcode Memory Profiler, memory, frame-rate &amp; UI optimization</w:t>
+        <w:t xml:space="preserve">Unity Profiler, Xcode Memory Profiler, memory, frame-rate and UI optimization</w:t>
       </w:r>
     </w:p>
     <w:p>
@@ -311,7 +427,7 @@
           <w:sz w:val="21"/>
           <w:szCs w:val="21"/>
         </w:rPr>
-        <w:t xml:space="preserve">SQL, database design, stored procedures, client-server architecture, player-data migration</w:t>
+        <w:t xml:space="preserve">SQL, database design, stored procedures, player-data migration</w:t>
       </w:r>
     </w:p>
     <w:p>
@@ -327,16 +443,16 @@
           <w:sz w:val="21"/>
           <w:szCs w:val="21"/>
         </w:rPr>
-        <w:t xml:space="preserve">UI: </w:t>
-      </w:r>
-      <w:r>
-        <w:rPr>
-          <w:rFonts w:ascii="Calibri" w:cs="Calibri" w:eastAsia="Calibri" w:hAnsi="Calibri"/>
-          <w:color w:val="1f2937"/>
-          <w:sz w:val="21"/>
-          <w:szCs w:val="21"/>
-        </w:rPr>
-        <w:t xml:space="preserve">UGUI, NGUI, complex, adaptive and responsive interface design &amp; implementation pixel perfect</w:t>
+        <w:t xml:space="preserve">AI tooling: </w:t>
+      </w:r>
+      <w:r>
+        <w:rPr>
+          <w:rFonts w:ascii="Calibri" w:cs="Calibri" w:eastAsia="Calibri" w:hAnsi="Calibri"/>
+          <w:color w:val="1f2937"/>
+          <w:sz w:val="21"/>
+          <w:szCs w:val="21"/>
+        </w:rPr>
+        <w:t xml:space="preserve">Claude Code, Codex, agent orchestration for development workflows</w:t>
       </w:r>
     </w:p>
     <w:p>
@@ -439,7 +555,28 @@
           <w:sz w:val="21"/>
           <w:szCs w:val="21"/>
         </w:rPr>
-        <w:t xml:space="preserve">3D High-fantasy MMORPG</w:t>
+        <w:t xml:space="preserve">3D high-fantasy MMORPG, PC (</w:t>
+      </w:r>
+      <w:hyperlink w:history="1" r:id="rIdspwjpguehqcbos5m8f9cr">
+        <w:r>
+          <w:rPr>
+            <w:rStyle w:val="Hyperlink"/>
+            <w:rFonts w:ascii="Calibri" w:cs="Calibri" w:eastAsia="Calibri" w:hAnsi="Calibri"/>
+            <w:color w:val="1f2937"/>
+            <w:sz w:val="21"/>
+            <w:szCs w:val="21"/>
+          </w:rPr>
+          <w:t xml:space="preserve">Steam Early Access</w:t>
+        </w:r>
+      </w:hyperlink>
+      <w:r>
+        <w:rPr>
+          <w:rFonts w:ascii="Calibri" w:cs="Calibri" w:eastAsia="Calibri" w:hAnsi="Calibri"/>
+          <w:color w:val="1f2937"/>
+          <w:sz w:val="21"/>
+          <w:szCs w:val="21"/>
+        </w:rPr>
+        <w:t xml:space="preserve">)</w:t>
       </w:r>
     </w:p>
     <w:p>
@@ -516,7 +653,7 @@
           <w:sz w:val="21"/>
           <w:szCs w:val="21"/>
         </w:rPr>
-        <w:t xml:space="preserve">Refactored and tuned the open-world climbing system.</w:t>
+        <w:t xml:space="preserve">Refactored and tuned open-world climbing (ladders, slopes, edge detection, hanging); fixed network physics and pathfinding issues.</w:t>
       </w:r>
     </w:p>
     <w:p>
@@ -554,7 +691,7 @@
           <w:sz w:val="21"/>
           <w:szCs w:val="21"/>
         </w:rPr>
-        <w:t xml:space="preserve">Fully refactored abilities loadout panel: added customization and increased usability.</w:t>
+        <w:t xml:space="preserve">Refactored the abilities loadout panel, adding customization and improving usability.</w:t>
       </w:r>
     </w:p>
     <w:p>
@@ -574,7 +711,7 @@
           <w:sz w:val="23"/>
           <w:szCs w:val="23"/>
         </w:rPr>
-        <w:t xml:space="preserve">Cubic Games</w:t>
+        <w:t xml:space="preserve">Relocation to the U.S.</w:t>
       </w:r>
       <w:r>
         <w:t xml:space="preserve">	</w:t>
@@ -586,7 +723,7 @@
           <w:sz w:val="21"/>
           <w:szCs w:val="21"/>
         </w:rPr>
-        <w:t xml:space="preserve">June 2023 – June 2024</w:t>
+        <w:t xml:space="preserve">June 2024 – September 2025</w:t>
       </w:r>
     </w:p>
     <w:p>
@@ -601,6 +738,53 @@
           <w:sz w:val="21"/>
           <w:szCs w:val="21"/>
         </w:rPr>
+        <w:t xml:space="preserve"/>
+      </w:r>
+    </w:p>
+    <w:p>
+      <w:pPr>
+        <w:keepNext/>
+        <w:tabs>
+          <w:tab w:val="right" w:pos="10512"/>
+        </w:tabs>
+        <w:spacing w:after="20" w:before="80"/>
+      </w:pPr>
+      <w:r>
+        <w:rPr>
+          <w:rFonts w:ascii="Calibri" w:cs="Calibri" w:eastAsia="Calibri" w:hAnsi="Calibri"/>
+          <w:b/>
+          <w:bCs/>
+          <w:color w:val="1f2937"/>
+          <w:sz w:val="23"/>
+          <w:szCs w:val="23"/>
+        </w:rPr>
+        <w:t xml:space="preserve">Cubic Games</w:t>
+      </w:r>
+      <w:r>
+        <w:t xml:space="preserve">	</w:t>
+      </w:r>
+      <w:r>
+        <w:rPr>
+          <w:rFonts w:ascii="Calibri" w:cs="Calibri" w:eastAsia="Calibri" w:hAnsi="Calibri"/>
+          <w:color w:val="4b5563"/>
+          <w:sz w:val="21"/>
+          <w:szCs w:val="21"/>
+        </w:rPr>
+        <w:t xml:space="preserve">June 2023 – June 2024</w:t>
+      </w:r>
+    </w:p>
+    <w:p>
+      <w:pPr>
+        <w:keepNext/>
+        <w:spacing w:after="20"/>
+      </w:pPr>
+      <w:r>
+        <w:rPr>
+          <w:rFonts w:ascii="Calibri" w:cs="Calibri" w:eastAsia="Calibri" w:hAnsi="Calibri"/>
+          <w:color w:val="4b5563"/>
+          <w:sz w:val="21"/>
+          <w:szCs w:val="21"/>
+        </w:rPr>
         <w:t xml:space="preserve">Unity Gameplay Engineer  |  Remote</w:t>
       </w:r>
     </w:p>
@@ -636,7 +820,28 @@
           <w:sz w:val="21"/>
           <w:szCs w:val="21"/>
         </w:rPr>
-        <w:t xml:space="preserve">3D Open-world multiplayer mobile game</w:t>
+        <w:t xml:space="preserve">3D open-world multiplayer mobile shooter, 50M+ downloads (</w:t>
+      </w:r>
+      <w:hyperlink w:history="1" r:id="rIdxzejnnuazb64ffh6qhil9">
+        <w:r>
+          <w:rPr>
+            <w:rStyle w:val="Hyperlink"/>
+            <w:rFonts w:ascii="Calibri" w:cs="Calibri" w:eastAsia="Calibri" w:hAnsi="Calibri"/>
+            <w:color w:val="1f2937"/>
+            <w:sz w:val="21"/>
+            <w:szCs w:val="21"/>
+          </w:rPr>
+          <w:t xml:space="preserve">Google Play</w:t>
+        </w:r>
+      </w:hyperlink>
+      <w:r>
+        <w:rPr>
+          <w:rFonts w:ascii="Calibri" w:cs="Calibri" w:eastAsia="Calibri" w:hAnsi="Calibri"/>
+          <w:color w:val="1f2937"/>
+          <w:sz w:val="21"/>
+          <w:szCs w:val="21"/>
+        </w:rPr>
+        <w:t xml:space="preserve">)</w:t>
       </w:r>
     </w:p>
     <w:p>
@@ -724,7 +929,7 @@
           <w:sz w:val="21"/>
           <w:szCs w:val="21"/>
         </w:rPr>
-        <w:t xml:space="preserve">network synchronization</w:t>
+        <w:t xml:space="preserve">network synchronization (Photon)</w:t>
       </w:r>
       <w:r>
         <w:rPr>
@@ -752,7 +957,7 @@
           <w:sz w:val="21"/>
           <w:szCs w:val="21"/>
         </w:rPr>
-        <w:t xml:space="preserve">Created designer tools for configuring NPCs, districts, spawners and waypoints.</w:t>
+        <w:t xml:space="preserve">Created designer tools (custom inspectors, scene gizmos) for configuring NPCs, districts, spawners and waypoints.</w:t>
       </w:r>
     </w:p>
     <w:p>
@@ -799,7 +1004,7 @@
           <w:sz w:val="21"/>
           <w:szCs w:val="21"/>
         </w:rPr>
-        <w:t xml:space="preserve">Lead Unity Gameplay Engineer  |  Remote</w:t>
+        <w:t xml:space="preserve">Lead Unity Engineer  |  Remote</w:t>
       </w:r>
     </w:p>
     <w:p>
@@ -855,16 +1060,16 @@
           <w:sz w:val="21"/>
           <w:szCs w:val="21"/>
         </w:rPr>
-        <w:t xml:space="preserve">Led a four-developer team</w:t>
-      </w:r>
-      <w:r>
-        <w:rPr>
-          <w:rFonts w:ascii="Calibri" w:cs="Calibri" w:eastAsia="Calibri" w:hAnsi="Calibri"/>
-          <w:color w:val="1f2937"/>
-          <w:sz w:val="21"/>
-          <w:szCs w:val="21"/>
-        </w:rPr>
-        <w:t xml:space="preserve">, owning planning, estimates, delivery and technical interviews.</w:t>
+        <w:t xml:space="preserve">Lead and primary developer</w:t>
+      </w:r>
+      <w:r>
+        <w:rPr>
+          <w:rFonts w:ascii="Calibri" w:cs="Calibri" w:eastAsia="Calibri" w:hAnsi="Calibri"/>
+          <w:color w:val="1f2937"/>
+          <w:sz w:val="21"/>
+          <w:szCs w:val="21"/>
+        </w:rPr>
+        <w:t xml:space="preserve"> of a new prototype, occasionally joined by a second engineer; owned planning, estimates and delivery.</w:t>
       </w:r>
     </w:p>
     <w:p>
@@ -908,24 +1113,18 @@
     <w:p>
       <w:pPr>
         <w:keepNext/>
-        <w:tabs>
-          <w:tab w:val="right" w:pos="10512"/>
-        </w:tabs>
-        <w:spacing w:after="20" w:before="80"/>
-      </w:pPr>
-      <w:r>
-        <w:rPr>
-          <w:rFonts w:ascii="Calibri" w:cs="Calibri" w:eastAsia="Calibri" w:hAnsi="Calibri"/>
-          <w:b/>
-          <w:bCs/>
-          <w:color w:val="1f2937"/>
-          <w:sz w:val="23"/>
-          <w:szCs w:val="23"/>
-        </w:rPr>
-        <w:t xml:space="preserve">ChillBase</w:t>
-      </w:r>
-      <w:r>
-        <w:t xml:space="preserve">	</w:t>
+        <w:spacing w:after="40" w:before="60"/>
+      </w:pPr>
+      <w:r>
+        <w:rPr>
+          <w:rFonts w:ascii="Calibri" w:cs="Calibri" w:eastAsia="Calibri" w:hAnsi="Calibri"/>
+          <w:b/>
+          <w:bCs/>
+          <w:color w:val="1e3a5f"/>
+          <w:sz w:val="21"/>
+          <w:szCs w:val="21"/>
+        </w:rPr>
+        <w:t xml:space="preserve">Beauty Tycoon</w:t>
       </w:r>
       <w:r>
         <w:rPr>
@@ -934,47 +1133,6 @@
           <w:sz w:val="21"/>
           <w:szCs w:val="21"/>
         </w:rPr>
-        <w:t xml:space="preserve">June 2020 – October 2022</w:t>
-      </w:r>
-    </w:p>
-    <w:p>
-      <w:pPr>
-        <w:keepNext/>
-        <w:spacing w:after="20"/>
-      </w:pPr>
-      <w:r>
-        <w:rPr>
-          <w:rFonts w:ascii="Calibri" w:cs="Calibri" w:eastAsia="Calibri" w:hAnsi="Calibri"/>
-          <w:color w:val="4b5563"/>
-          <w:sz w:val="21"/>
-          <w:szCs w:val="21"/>
-        </w:rPr>
-        <w:t xml:space="preserve">Unity Gameplay Engineer  |  In-Site</w:t>
-      </w:r>
-    </w:p>
-    <w:p>
-      <w:pPr>
-        <w:keepNext/>
-        <w:spacing w:after="40"/>
-      </w:pPr>
-      <w:r>
-        <w:rPr>
-          <w:rFonts w:ascii="Calibri" w:cs="Calibri" w:eastAsia="Calibri" w:hAnsi="Calibri"/>
-          <w:b/>
-          <w:bCs/>
-          <w:color w:val="1e3a5f"/>
-          <w:sz w:val="21"/>
-          <w:szCs w:val="21"/>
-        </w:rPr>
-        <w:t xml:space="preserve">Combat Quest</w:t>
-      </w:r>
-      <w:r>
-        <w:rPr>
-          <w:rFonts w:ascii="Calibri" w:cs="Calibri" w:eastAsia="Calibri" w:hAnsi="Calibri"/>
-          <w:color w:val="4b5563"/>
-          <w:sz w:val="21"/>
-          <w:szCs w:val="21"/>
-        </w:rPr>
         <w:t xml:space="preserve">  |  </w:t>
       </w:r>
       <w:r>
@@ -984,7 +1142,28 @@
           <w:sz w:val="21"/>
           <w:szCs w:val="21"/>
         </w:rPr>
-        <w:t xml:space="preserve">3D Mobile action RPG</w:t>
+        <w:t xml:space="preserve">Mobile hair-salon tycoon game (</w:t>
+      </w:r>
+      <w:hyperlink w:history="1" r:id="rIdwgilctdbwcut61nheks36">
+        <w:r>
+          <w:rPr>
+            <w:rStyle w:val="Hyperlink"/>
+            <w:rFonts w:ascii="Calibri" w:cs="Calibri" w:eastAsia="Calibri" w:hAnsi="Calibri"/>
+            <w:color w:val="1f2937"/>
+            <w:sz w:val="21"/>
+            <w:szCs w:val="21"/>
+          </w:rPr>
+          <w:t xml:space="preserve">App Store</w:t>
+        </w:r>
+      </w:hyperlink>
+      <w:r>
+        <w:rPr>
+          <w:rFonts w:ascii="Calibri" w:cs="Calibri" w:eastAsia="Calibri" w:hAnsi="Calibri"/>
+          <w:color w:val="1f2937"/>
+          <w:sz w:val="21"/>
+          <w:szCs w:val="21"/>
+        </w:rPr>
+        <w:t xml:space="preserve">)</w:t>
       </w:r>
     </w:p>
     <w:p>
@@ -1005,16 +1184,119 @@
           <w:sz w:val="21"/>
           <w:szCs w:val="21"/>
         </w:rPr>
-        <w:t xml:space="preserve">Tripled monthly revenue</w:t>
-      </w:r>
-      <w:r>
-        <w:rPr>
-          <w:rFonts w:ascii="Calibri" w:cs="Calibri" w:eastAsia="Calibri" w:hAnsi="Calibri"/>
-          <w:color w:val="1f2937"/>
-          <w:sz w:val="21"/>
-          <w:szCs w:val="21"/>
-        </w:rPr>
-        <w:t xml:space="preserve"> by reworking the in-game offers system.</w:t>
+        <w:t xml:space="preserve">Led a team of four programmers</w:t>
+      </w:r>
+      <w:r>
+        <w:rPr>
+          <w:rFonts w:ascii="Calibri" w:cs="Calibri" w:eastAsia="Calibri" w:hAnsi="Calibri"/>
+          <w:color w:val="1f2937"/>
+          <w:sz w:val="21"/>
+          <w:szCs w:val="21"/>
+        </w:rPr>
+        <w:t xml:space="preserve"> on the live project, owning planning and coordination.</w:t>
+      </w:r>
+    </w:p>
+    <w:p>
+      <w:pPr>
+        <w:keepNext/>
+        <w:tabs>
+          <w:tab w:val="right" w:pos="10512"/>
+        </w:tabs>
+        <w:spacing w:after="20" w:before="80"/>
+      </w:pPr>
+      <w:r>
+        <w:rPr>
+          <w:rFonts w:ascii="Calibri" w:cs="Calibri" w:eastAsia="Calibri" w:hAnsi="Calibri"/>
+          <w:b/>
+          <w:bCs/>
+          <w:color w:val="1f2937"/>
+          <w:sz w:val="23"/>
+          <w:szCs w:val="23"/>
+        </w:rPr>
+        <w:t xml:space="preserve">ChillBase (formerly ChillGaming)</w:t>
+      </w:r>
+      <w:r>
+        <w:t xml:space="preserve">	</w:t>
+      </w:r>
+      <w:r>
+        <w:rPr>
+          <w:rFonts w:ascii="Calibri" w:cs="Calibri" w:eastAsia="Calibri" w:hAnsi="Calibri"/>
+          <w:color w:val="4b5563"/>
+          <w:sz w:val="21"/>
+          <w:szCs w:val="21"/>
+        </w:rPr>
+        <w:t xml:space="preserve">June 2020 – October 2022</w:t>
+      </w:r>
+    </w:p>
+    <w:p>
+      <w:pPr>
+        <w:keepNext/>
+        <w:spacing w:after="20"/>
+      </w:pPr>
+      <w:r>
+        <w:rPr>
+          <w:rFonts w:ascii="Calibri" w:cs="Calibri" w:eastAsia="Calibri" w:hAnsi="Calibri"/>
+          <w:color w:val="4b5563"/>
+          <w:sz w:val="21"/>
+          <w:szCs w:val="21"/>
+        </w:rPr>
+        <w:t xml:space="preserve">Unity Gameplay Engineer  |  On-site</w:t>
+      </w:r>
+    </w:p>
+    <w:p>
+      <w:pPr>
+        <w:keepNext/>
+        <w:spacing w:after="40"/>
+      </w:pPr>
+      <w:r>
+        <w:rPr>
+          <w:rFonts w:ascii="Calibri" w:cs="Calibri" w:eastAsia="Calibri" w:hAnsi="Calibri"/>
+          <w:b/>
+          <w:bCs/>
+          <w:color w:val="1e3a5f"/>
+          <w:sz w:val="21"/>
+          <w:szCs w:val="21"/>
+        </w:rPr>
+        <w:t xml:space="preserve">Combat Quest</w:t>
+      </w:r>
+      <w:r>
+        <w:rPr>
+          <w:rFonts w:ascii="Calibri" w:cs="Calibri" w:eastAsia="Calibri" w:hAnsi="Calibri"/>
+          <w:color w:val="4b5563"/>
+          <w:sz w:val="21"/>
+          <w:szCs w:val="21"/>
+        </w:rPr>
+        <w:t xml:space="preserve">  |  </w:t>
+      </w:r>
+      <w:r>
+        <w:rPr>
+          <w:rFonts w:ascii="Calibri" w:cs="Calibri" w:eastAsia="Calibri" w:hAnsi="Calibri"/>
+          <w:color w:val="1f2937"/>
+          <w:sz w:val="21"/>
+          <w:szCs w:val="21"/>
+        </w:rPr>
+        <w:t xml:space="preserve">3D mobile action RPG, 1M+ downloads, 4.5+ rating (</w:t>
+      </w:r>
+      <w:hyperlink w:history="1" r:id="rIdtu3v2s42jiph8csn09za2">
+        <w:r>
+          <w:rPr>
+            <w:rStyle w:val="Hyperlink"/>
+            <w:rFonts w:ascii="Calibri" w:cs="Calibri" w:eastAsia="Calibri" w:hAnsi="Calibri"/>
+            <w:color w:val="1f2937"/>
+            <w:sz w:val="21"/>
+            <w:szCs w:val="21"/>
+          </w:rPr>
+          <w:t xml:space="preserve">Google Play</w:t>
+        </w:r>
+      </w:hyperlink>
+      <w:r>
+        <w:rPr>
+          <w:rFonts w:ascii="Calibri" w:cs="Calibri" w:eastAsia="Calibri" w:hAnsi="Calibri"/>
+          <w:color w:val="1f2937"/>
+          <w:sz w:val="21"/>
+          <w:szCs w:val="21"/>
+        </w:rPr>
+        <w:t xml:space="preserve">)</w:t>
       </w:r>
     </w:p>
     <w:p>
@@ -1029,11 +1311,22 @@
       <w:r>
         <w:rPr>
           <w:rFonts w:ascii="Calibri" w:cs="Calibri" w:eastAsia="Calibri" w:hAnsi="Calibri"/>
-          <w:color w:val="1f2937"/>
-          <w:sz w:val="21"/>
-          <w:szCs w:val="21"/>
-        </w:rPr>
-        <w:t xml:space="preserve">Built PvP gameplay, refined the ability system, and created VFX and SFX systems.</w:t>
+          <w:b/>
+          <w:bCs/>
+          <w:color w:val="1f2937"/>
+          <w:sz w:val="21"/>
+          <w:szCs w:val="21"/>
+        </w:rPr>
+        <w:t xml:space="preserve">Tripled monthly revenue</w:t>
+      </w:r>
+      <w:r>
+        <w:rPr>
+          <w:rFonts w:ascii="Calibri" w:cs="Calibri" w:eastAsia="Calibri" w:hAnsi="Calibri"/>
+          <w:color w:val="1f2937"/>
+          <w:sz w:val="21"/>
+          <w:szCs w:val="21"/>
+        </w:rPr>
+        <w:t xml:space="preserve"> by reworking the in-game offers system.</w:t>
       </w:r>
     </w:p>
     <w:p>
@@ -1048,22 +1341,11 @@
       <w:r>
         <w:rPr>
           <w:rFonts w:ascii="Calibri" w:cs="Calibri" w:eastAsia="Calibri" w:hAnsi="Calibri"/>
-          <w:b/>
-          <w:bCs/>
-          <w:color w:val="1f2937"/>
-          <w:sz w:val="21"/>
-          <w:szCs w:val="21"/>
-        </w:rPr>
-        <w:t xml:space="preserve">Reduced memory usage to restore support for older devices</w:t>
-      </w:r>
-      <w:r>
-        <w:rPr>
-          <w:rFonts w:ascii="Calibri" w:cs="Calibri" w:eastAsia="Calibri" w:hAnsi="Calibri"/>
-          <w:color w:val="1f2937"/>
-          <w:sz w:val="21"/>
-          <w:szCs w:val="21"/>
-        </w:rPr>
-        <w:t xml:space="preserve">; optimized graphics and UI.</w:t>
+          <w:color w:val="1f2937"/>
+          <w:sz w:val="21"/>
+          <w:szCs w:val="21"/>
+        </w:rPr>
+        <w:t xml:space="preserve">Built PvP gameplay, refined the ability system, and created VFX and SFX systems.</w:t>
       </w:r>
     </w:p>
     <w:p>
@@ -1078,11 +1360,22 @@
       <w:r>
         <w:rPr>
           <w:rFonts w:ascii="Calibri" w:cs="Calibri" w:eastAsia="Calibri" w:hAnsi="Calibri"/>
-          <w:color w:val="1f2937"/>
-          <w:sz w:val="21"/>
-          <w:szCs w:val="21"/>
-        </w:rPr>
-        <w:t xml:space="preserve">Implemented advertising, battle pass and daily tasks; reworked cross-store payment processing.</w:t>
+          <w:b/>
+          <w:bCs/>
+          <w:color w:val="1f2937"/>
+          <w:sz w:val="21"/>
+          <w:szCs w:val="21"/>
+        </w:rPr>
+        <w:t xml:space="preserve">Cut memory usage to 2 GB</w:t>
+      </w:r>
+      <w:r>
+        <w:rPr>
+          <w:rFonts w:ascii="Calibri" w:cs="Calibri" w:eastAsia="Calibri" w:hAnsi="Calibri"/>
+          <w:color w:val="1f2937"/>
+          <w:sz w:val="21"/>
+          <w:szCs w:val="21"/>
+        </w:rPr>
+        <w:t xml:space="preserve">, restoring support for older devices; optimized graphics and UI.</w:t>
       </w:r>
     </w:p>
     <w:p>
@@ -1101,7 +1394,7 @@
           <w:sz w:val="21"/>
           <w:szCs w:val="21"/>
         </w:rPr>
-        <w:t xml:space="preserve">Delivered meta-gameplay systems, including cutscenes, a global map and tutorials.</w:t>
+        <w:t xml:space="preserve">Implemented advertising, battle pass and daily tasks; reworked cross-store payment processing.</w:t>
       </w:r>
     </w:p>
     <w:p>
@@ -1120,89 +1413,7 @@
           <w:sz w:val="21"/>
           <w:szCs w:val="21"/>
         </w:rPr>
-        <w:t xml:space="preserve">Owned CI/CD and shipped iOS and Android releases.</w:t>
-      </w:r>
-    </w:p>
-    <w:p>
-      <w:pPr>
-        <w:keepNext/>
-        <w:tabs>
-          <w:tab w:val="right" w:pos="10512"/>
-        </w:tabs>
-        <w:spacing w:after="20" w:before="80"/>
-      </w:pPr>
-      <w:r>
-        <w:rPr>
-          <w:rFonts w:ascii="Calibri" w:cs="Calibri" w:eastAsia="Calibri" w:hAnsi="Calibri"/>
-          <w:b/>
-          <w:bCs/>
-          <w:color w:val="1f2937"/>
-          <w:sz w:val="23"/>
-          <w:szCs w:val="23"/>
-        </w:rPr>
-        <w:t xml:space="preserve">Moscow Factory of Thermal Automatics</w:t>
-      </w:r>
-      <w:r>
-        <w:t xml:space="preserve">	</w:t>
-      </w:r>
-      <w:r>
-        <w:rPr>
-          <w:rFonts w:ascii="Calibri" w:cs="Calibri" w:eastAsia="Calibri" w:hAnsi="Calibri"/>
-          <w:color w:val="4b5563"/>
-          <w:sz w:val="21"/>
-          <w:szCs w:val="21"/>
-        </w:rPr>
-        <w:t xml:space="preserve">May 2015 – June 2020</w:t>
-      </w:r>
-    </w:p>
-    <w:p>
-      <w:pPr>
-        <w:keepNext/>
-        <w:spacing w:after="20"/>
-      </w:pPr>
-      <w:r>
-        <w:rPr>
-          <w:rFonts w:ascii="Calibri" w:cs="Calibri" w:eastAsia="Calibri" w:hAnsi="Calibri"/>
-          <w:color w:val="4b5563"/>
-          <w:sz w:val="21"/>
-          <w:szCs w:val="21"/>
-        </w:rPr>
-        <w:t xml:space="preserve">Software and Hardware Engineer  |  In-Site</w:t>
-      </w:r>
-    </w:p>
-    <w:p>
-      <w:pPr>
-        <w:keepNext/>
-        <w:spacing w:after="40"/>
-      </w:pPr>
-      <w:r>
-        <w:rPr>
-          <w:rFonts w:ascii="Calibri" w:cs="Calibri" w:eastAsia="Calibri" w:hAnsi="Calibri"/>
-          <w:b/>
-          <w:bCs/>
-          <w:color w:val="1e3a5f"/>
-          <w:sz w:val="21"/>
-          <w:szCs w:val="21"/>
-        </w:rPr>
-        <w:t xml:space="preserve">SuperSCADA (2018–2020)</w:t>
-      </w:r>
-      <w:r>
-        <w:rPr>
-          <w:rFonts w:ascii="Calibri" w:cs="Calibri" w:eastAsia="Calibri" w:hAnsi="Calibri"/>
-          <w:color w:val="4b5563"/>
-          <w:sz w:val="21"/>
-          <w:szCs w:val="21"/>
-        </w:rPr>
-        <w:t xml:space="preserve">  |  </w:t>
-      </w:r>
-      <w:r>
-        <w:rPr>
-          <w:rFonts w:ascii="Calibri" w:cs="Calibri" w:eastAsia="Calibri" w:hAnsi="Calibri"/>
-          <w:color w:val="1f2937"/>
-          <w:sz w:val="21"/>
-          <w:szCs w:val="21"/>
-        </w:rPr>
-        <w:t xml:space="preserve">Unity industrial application for PC and mobile</w:t>
+        <w:t xml:space="preserve">Delivered meta-gameplay systems, including cutscenes, a global map and tutorials.</w:t>
       </w:r>
     </w:p>
     <w:p>
@@ -1221,7 +1432,110 @@
           <w:sz w:val="21"/>
           <w:szCs w:val="21"/>
         </w:rPr>
-        <w:t xml:space="preserve">The prototype won a Skolkovo grant.</w:t>
+        <w:t xml:space="preserve">Owned CI/CD, remote config and DLC; shipped iOS and Android releases through soft and worldwide launch.</w:t>
+      </w:r>
+    </w:p>
+    <w:p>
+      <w:pPr>
+        <w:keepNext/>
+        <w:tabs>
+          <w:tab w:val="right" w:pos="10512"/>
+        </w:tabs>
+        <w:spacing w:after="20" w:before="80"/>
+      </w:pPr>
+      <w:r>
+        <w:rPr>
+          <w:rFonts w:ascii="Calibri" w:cs="Calibri" w:eastAsia="Calibri" w:hAnsi="Calibri"/>
+          <w:b/>
+          <w:bCs/>
+          <w:color w:val="1f2937"/>
+          <w:sz w:val="23"/>
+          <w:szCs w:val="23"/>
+        </w:rPr>
+        <w:t xml:space="preserve">MZTA (Moscow Factory of Thermal Automatics)</w:t>
+      </w:r>
+      <w:r>
+        <w:t xml:space="preserve">	</w:t>
+      </w:r>
+      <w:r>
+        <w:rPr>
+          <w:rFonts w:ascii="Calibri" w:cs="Calibri" w:eastAsia="Calibri" w:hAnsi="Calibri"/>
+          <w:color w:val="4b5563"/>
+          <w:sz w:val="21"/>
+          <w:szCs w:val="21"/>
+        </w:rPr>
+        <w:t xml:space="preserve">May 2015 – June 2020</w:t>
+      </w:r>
+    </w:p>
+    <w:p>
+      <w:pPr>
+        <w:keepNext/>
+        <w:spacing w:after="20"/>
+      </w:pPr>
+      <w:r>
+        <w:rPr>
+          <w:rFonts w:ascii="Calibri" w:cs="Calibri" w:eastAsia="Calibri" w:hAnsi="Calibri"/>
+          <w:color w:val="4b5563"/>
+          <w:sz w:val="21"/>
+          <w:szCs w:val="21"/>
+        </w:rPr>
+        <w:t xml:space="preserve">Firmware Engineer → Angular Developer → Unity Software Engineer  |  On-site</w:t>
+      </w:r>
+    </w:p>
+    <w:p>
+      <w:pPr>
+        <w:keepNext/>
+        <w:spacing w:after="40"/>
+      </w:pPr>
+      <w:r>
+        <w:rPr>
+          <w:rFonts w:ascii="Calibri" w:cs="Calibri" w:eastAsia="Calibri" w:hAnsi="Calibri"/>
+          <w:b/>
+          <w:bCs/>
+          <w:color w:val="1e3a5f"/>
+          <w:sz w:val="21"/>
+          <w:szCs w:val="21"/>
+        </w:rPr>
+        <w:t xml:space="preserve">Unity Software Engineer (2018–2020)</w:t>
+      </w:r>
+      <w:r>
+        <w:rPr>
+          <w:rFonts w:ascii="Calibri" w:cs="Calibri" w:eastAsia="Calibri" w:hAnsi="Calibri"/>
+          <w:color w:val="4b5563"/>
+          <w:sz w:val="21"/>
+          <w:szCs w:val="21"/>
+        </w:rPr>
+        <w:t xml:space="preserve">  |  </w:t>
+      </w:r>
+      <w:r>
+        <w:rPr>
+          <w:rFonts w:ascii="Calibri" w:cs="Calibri" w:eastAsia="Calibri" w:hAnsi="Calibri"/>
+          <w:color w:val="1f2937"/>
+          <w:sz w:val="21"/>
+          <w:szCs w:val="21"/>
+        </w:rPr>
+        <w:t xml:space="preserve">SuperSCADA, industrial SCADA suite built on Unity (</w:t>
+      </w:r>
+      <w:hyperlink w:history="1" r:id="rIdyd5baxwzlitp0kyv_0d1o">
+        <w:r>
+          <w:rPr>
+            <w:rStyle w:val="Hyperlink"/>
+            <w:rFonts w:ascii="Calibri" w:cs="Calibri" w:eastAsia="Calibri" w:hAnsi="Calibri"/>
+            <w:color w:val="1f2937"/>
+            <w:sz w:val="21"/>
+            <w:szCs w:val="21"/>
+          </w:rPr>
+          <w:t xml:space="preserve">product page</w:t>
+        </w:r>
+      </w:hyperlink>
+      <w:r>
+        <w:rPr>
+          <w:rFonts w:ascii="Calibri" w:cs="Calibri" w:eastAsia="Calibri" w:hAnsi="Calibri"/>
+          <w:color w:val="1f2937"/>
+          <w:sz w:val="21"/>
+          <w:szCs w:val="21"/>
+        </w:rPr>
+        <w:t xml:space="preserve">)</w:t>
       </w:r>
     </w:p>
     <w:p>
@@ -1240,7 +1554,7 @@
           <w:sz w:val="21"/>
           <w:szCs w:val="21"/>
         </w:rPr>
-        <w:t xml:space="preserve">Owned core architecture.</w:t>
+        <w:t xml:space="preserve">Owned core architecture; the prototype won a Skolkovo innovation grant.</w:t>
       </w:r>
     </w:p>
     <w:p>
@@ -1259,7 +1573,42 @@
           <w:sz w:val="21"/>
           <w:szCs w:val="21"/>
         </w:rPr>
-        <w:t xml:space="preserve">Built an IDE-style, dockable, adaptive UI.</w:t>
+        <w:t xml:space="preserve">Built an IDE-style dockable, adaptive UI with node-graph and code editors for industrial controller languages (IEC 61131-3).</w:t>
+      </w:r>
+    </w:p>
+    <w:p>
+      <w:pPr>
+        <w:keepNext/>
+        <w:spacing w:after="40" w:before="60"/>
+      </w:pPr>
+      <w:r>
+        <w:rPr>
+          <w:rFonts w:ascii="Calibri" w:cs="Calibri" w:eastAsia="Calibri" w:hAnsi="Calibri"/>
+          <w:b/>
+          <w:bCs/>
+          <w:color w:val="1e3a5f"/>
+          <w:sz w:val="21"/>
+          <w:szCs w:val="21"/>
+        </w:rPr>
+        <w:t xml:space="preserve">Angular Developer (2017–2018)</w:t>
+      </w:r>
+      <w:r>
+        <w:rPr>
+          <w:rFonts w:ascii="Calibri" w:cs="Calibri" w:eastAsia="Calibri" w:hAnsi="Calibri"/>
+          <w:color w:val="4b5563"/>
+          <w:sz w:val="21"/>
+          <w:szCs w:val="21"/>
+        </w:rPr>
+        <w:t xml:space="preserve">  |  </w:t>
+      </w:r>
+      <w:r>
+        <w:rPr>
+          <w:rFonts w:ascii="Calibri" w:cs="Calibri" w:eastAsia="Calibri" w:hAnsi="Calibri"/>
+          <w:color w:val="1f2937"/>
+          <w:sz w:val="21"/>
+          <w:szCs w:val="21"/>
+        </w:rPr>
+        <w:t xml:space="preserve">Web platform for property managers and tenants</w:t>
       </w:r>
     </w:p>
     <w:p>
@@ -1278,7 +1627,42 @@
           <w:sz w:val="21"/>
           <w:szCs w:val="21"/>
         </w:rPr>
-        <w:t xml:space="preserve">Responsible for graph and code editors for FBD, LD and ST languages.</w:t>
+        <w:t xml:space="preserve">Built meter-reading graphs, bill input, tenant chat and a forum.</w:t>
+      </w:r>
+    </w:p>
+    <w:p>
+      <w:pPr>
+        <w:keepNext/>
+        <w:spacing w:after="40" w:before="60"/>
+      </w:pPr>
+      <w:r>
+        <w:rPr>
+          <w:rFonts w:ascii="Calibri" w:cs="Calibri" w:eastAsia="Calibri" w:hAnsi="Calibri"/>
+          <w:b/>
+          <w:bCs/>
+          <w:color w:val="1e3a5f"/>
+          <w:sz w:val="21"/>
+          <w:szCs w:val="21"/>
+        </w:rPr>
+        <w:t xml:space="preserve">Firmware Engineer (2015–2017)</w:t>
+      </w:r>
+      <w:r>
+        <w:rPr>
+          <w:rFonts w:ascii="Calibri" w:cs="Calibri" w:eastAsia="Calibri" w:hAnsi="Calibri"/>
+          <w:color w:val="4b5563"/>
+          <w:sz w:val="21"/>
+          <w:szCs w:val="21"/>
+        </w:rPr>
+        <w:t xml:space="preserve">  |  </w:t>
+      </w:r>
+      <w:r>
+        <w:rPr>
+          <w:rFonts w:ascii="Calibri" w:cs="Calibri" w:eastAsia="Calibri" w:hAnsi="Calibri"/>
+          <w:color w:val="1f2937"/>
+          <w:sz w:val="21"/>
+          <w:szCs w:val="21"/>
+        </w:rPr>
+        <w:t xml:space="preserve">Hired part-time while at university, full-time from 2016</w:t>
       </w:r>
     </w:p>
     <w:p>
@@ -1297,89 +1681,7 @@
           <w:sz w:val="21"/>
           <w:szCs w:val="21"/>
         </w:rPr>
-        <w:t xml:space="preserve">Tested and deployed across multiple target environments.</w:t>
-      </w:r>
-    </w:p>
-    <w:p>
-      <w:pPr>
-        <w:keepNext/>
-        <w:spacing w:after="40" w:before="60"/>
-      </w:pPr>
-      <w:r>
-        <w:rPr>
-          <w:rFonts w:ascii="Calibri" w:cs="Calibri" w:eastAsia="Calibri" w:hAnsi="Calibri"/>
-          <w:b/>
-          <w:bCs/>
-          <w:color w:val="1e3a5f"/>
-          <w:sz w:val="21"/>
-          <w:szCs w:val="21"/>
-        </w:rPr>
-        <w:t xml:space="preserve">Earlier work (2015–2018)</w:t>
-      </w:r>
-      <w:r>
-        <w:rPr>
-          <w:rFonts w:ascii="Calibri" w:cs="Calibri" w:eastAsia="Calibri" w:hAnsi="Calibri"/>
-          <w:sz w:val="21"/>
-          <w:szCs w:val="21"/>
-        </w:rPr>
-        <w:t xml:space="preserve">:</w:t>
-      </w:r>
-    </w:p>
-    <w:p>
-      <w:pPr>
-        <w:pStyle w:val="ListParagraph"/>
-        <w:numPr>
-          <w:ilvl w:val="0"/>
-          <w:numId w:val="2"/>
-        </w:numPr>
-        <w:spacing w:after="30" w:line="312"/>
-      </w:pPr>
-      <w:r>
-        <w:rPr>
-          <w:rFonts w:ascii="Calibri" w:cs="Calibri" w:eastAsia="Calibri" w:hAnsi="Calibri"/>
-          <w:color w:val="1f2937"/>
-          <w:sz w:val="21"/>
-          <w:szCs w:val="21"/>
-        </w:rPr>
-        <w:t xml:space="preserve">Built platform for property management companies and tenants using Angular,</w:t>
-      </w:r>
-    </w:p>
-    <w:p>
-      <w:pPr>
-        <w:pStyle w:val="ListParagraph"/>
-        <w:numPr>
-          <w:ilvl w:val="0"/>
-          <w:numId w:val="2"/>
-        </w:numPr>
-        <w:spacing w:after="30" w:line="312"/>
-      </w:pPr>
-      <w:r>
-        <w:rPr>
-          <w:rFonts w:ascii="Calibri" w:cs="Calibri" w:eastAsia="Calibri" w:hAnsi="Calibri"/>
-          <w:color w:val="1f2937"/>
-          <w:sz w:val="21"/>
-          <w:szCs w:val="21"/>
-        </w:rPr>
-        <w:t xml:space="preserve">Implemented new editor features to IDE applications using WPF.</w:t>
-      </w:r>
-    </w:p>
-    <w:p>
-      <w:pPr>
-        <w:pStyle w:val="ListParagraph"/>
-        <w:numPr>
-          <w:ilvl w:val="0"/>
-          <w:numId w:val="2"/>
-        </w:numPr>
-        <w:spacing w:after="30" w:line="312"/>
-      </w:pPr>
-      <w:r>
-        <w:rPr>
-          <w:rFonts w:ascii="Calibri" w:cs="Calibri" w:eastAsia="Calibri" w:hAnsi="Calibri"/>
-          <w:color w:val="1f2937"/>
-          <w:sz w:val="21"/>
-          <w:szCs w:val="21"/>
-        </w:rPr>
-        <w:t xml:space="preserve">Developed controller firmware supporting RS232/RS485 and Modbus.</w:t>
+        <w:t xml:space="preserve">Wrote C# controller firmware (RS-232/RS-485, Modbus) and added editor features to a WPF IDE.</w:t>
       </w:r>
     </w:p>
     <w:p>
@@ -1711,7 +2013,7 @@
         <w:sz w:val="19"/>
         <w:szCs w:val="19"/>
       </w:rPr>
-      <w:t xml:space="preserve">Senior Unity Gameplay Engineer</w:t>
+      <w:t xml:space="preserve">Unity Gameplay Engineer</w:t>
     </w:r>
   </w:p>
 </w:hdr>

</xml_diff>

<commit_message>
Added short name to resume
</commit_message>
<xml_diff>
--- a/Resume_Gameplay_Engineer.docx
+++ b/Resume_Gameplay_Engineer.docx
@@ -15,7 +15,7 @@
           <w:sz w:val="44"/>
           <w:szCs w:val="44"/>
         </w:rPr>
-        <w:t xml:space="preserve">Viacheslav Chudaev</w:t>
+        <w:t xml:space="preserve">Viacheslav (Slava) Chudaev</w:t>
       </w:r>
     </w:p>
     <w:p>
@@ -45,7 +45,7 @@
         </w:rPr>
         <w:t xml:space="preserve">Portland, OR  ·  </w:t>
       </w:r>
-      <w:hyperlink w:history="1" r:id="rId5jeuwywhtnhwu5co1uyl_">
+      <w:hyperlink w:history="1" r:id="rIdmw9c9exesjxzdj-s3t7do">
         <w:r>
           <w:rPr>
             <w:rStyle w:val="Hyperlink"/>
@@ -66,7 +66,7 @@
         </w:rPr>
         <w:t xml:space="preserve">  ·  </w:t>
       </w:r>
-      <w:hyperlink w:history="1" r:id="rIdmglskvbtml4uprrhy0v37">
+      <w:hyperlink w:history="1" r:id="rId7tvhsjswobg84yl6hk4zn">
         <w:r>
           <w:rPr>
             <w:rStyle w:val="Hyperlink"/>
@@ -87,7 +87,7 @@
         </w:rPr>
         <w:t xml:space="preserve">  ·  </w:t>
       </w:r>
-      <w:hyperlink w:history="1" r:id="rIdcesowvenm24gjtwwbraak">
+      <w:hyperlink w:history="1" r:id="rIdrmxonh-mx1uzkoy5dr91l">
         <w:r>
           <w:rPr>
             <w:rStyle w:val="Hyperlink"/>
@@ -557,7 +557,7 @@
         </w:rPr>
         <w:t xml:space="preserve">3D high-fantasy MMORPG, PC (</w:t>
       </w:r>
-      <w:hyperlink w:history="1" r:id="rIdspwjpguehqcbos5m8f9cr">
+      <w:hyperlink w:history="1" r:id="rIdkmhs0h5k32fpk7v8fotus">
         <w:r>
           <w:rPr>
             <w:rStyle w:val="Hyperlink"/>
@@ -822,7 +822,7 @@
         </w:rPr>
         <w:t xml:space="preserve">3D open-world multiplayer mobile shooter, 50M+ downloads (</w:t>
       </w:r>
-      <w:hyperlink w:history="1" r:id="rIdxzejnnuazb64ffh6qhil9">
+      <w:hyperlink w:history="1" r:id="rId98k5puil9mqqdk2sykdue">
         <w:r>
           <w:rPr>
             <w:rStyle w:val="Hyperlink"/>
@@ -1144,7 +1144,7 @@
         </w:rPr>
         <w:t xml:space="preserve">Mobile hair-salon tycoon game (</w:t>
       </w:r>
-      <w:hyperlink w:history="1" r:id="rIdwgilctdbwcut61nheks36">
+      <w:hyperlink w:history="1" r:id="rIdnvc4vdf9gwgiqg7rezzaf">
         <w:r>
           <w:rPr>
             <w:rStyle w:val="Hyperlink"/>
@@ -1277,7 +1277,7 @@
         </w:rPr>
         <w:t xml:space="preserve">3D mobile action RPG, 1M+ downloads, 4.5+ rating (</w:t>
       </w:r>
-      <w:hyperlink w:history="1" r:id="rIdtu3v2s42jiph8csn09za2">
+      <w:hyperlink w:history="1" r:id="rIdizr5_5f198ilixeapp64c">
         <w:r>
           <w:rPr>
             <w:rStyle w:val="Hyperlink"/>
@@ -1516,7 +1516,7 @@
         </w:rPr>
         <w:t xml:space="preserve">SuperSCADA, industrial SCADA suite built on Unity (</w:t>
       </w:r>
-      <w:hyperlink w:history="1" r:id="rIdyd5baxwzlitp0kyv_0d1o">
+      <w:hyperlink w:history="1" r:id="rIdfefjdcqc5vosqdvqezxi8">
         <w:r>
           <w:rPr>
             <w:rStyle w:val="Hyperlink"/>
@@ -2002,7 +2002,7 @@
         <w:sz w:val="19"/>
         <w:szCs w:val="19"/>
       </w:rPr>
-      <w:t xml:space="preserve">VIACHESLAV CHUDAEV</w:t>
+      <w:t xml:space="preserve">VIACHESLAV (SLAVA) CHUDAEV</w:t>
     </w:r>
     <w:r>
       <w:t xml:space="preserve">	</w:t>

</xml_diff>

<commit_message>
Reword SuperSCADA role and add short name to README title
Co-Authored-By: Claude Opus 5.5 <noreply@anthropic.com>
</commit_message>
<xml_diff>
--- a/Resume_Gameplay_Engineer.docx
+++ b/Resume_Gameplay_Engineer.docx
@@ -45,7 +45,7 @@
         </w:rPr>
         <w:t xml:space="preserve">Portland, OR  ·  </w:t>
       </w:r>
-      <w:hyperlink w:history="1" r:id="rIdmw9c9exesjxzdj-s3t7do">
+      <w:hyperlink w:history="1" r:id="rIdjrhid7t52-lnorofskton">
         <w:r>
           <w:rPr>
             <w:rStyle w:val="Hyperlink"/>
@@ -66,7 +66,7 @@
         </w:rPr>
         <w:t xml:space="preserve">  ·  </w:t>
       </w:r>
-      <w:hyperlink w:history="1" r:id="rId7tvhsjswobg84yl6hk4zn">
+      <w:hyperlink w:history="1" r:id="rId6sxuvqdj-xnyuzbze2qy9">
         <w:r>
           <w:rPr>
             <w:rStyle w:val="Hyperlink"/>
@@ -87,7 +87,7 @@
         </w:rPr>
         <w:t xml:space="preserve">  ·  </w:t>
       </w:r>
-      <w:hyperlink w:history="1" r:id="rIdrmxonh-mx1uzkoy5dr91l">
+      <w:hyperlink w:history="1" r:id="rIdk-uu8j4wq4mqqxw8jait0">
         <w:r>
           <w:rPr>
             <w:rStyle w:val="Hyperlink"/>
@@ -557,7 +557,7 @@
         </w:rPr>
         <w:t xml:space="preserve">3D high-fantasy MMORPG, PC (</w:t>
       </w:r>
-      <w:hyperlink w:history="1" r:id="rIdkmhs0h5k32fpk7v8fotus">
+      <w:hyperlink w:history="1" r:id="rIdp_p7-cyevzodjrdrst_xb">
         <w:r>
           <w:rPr>
             <w:rStyle w:val="Hyperlink"/>
@@ -822,7 +822,7 @@
         </w:rPr>
         <w:t xml:space="preserve">3D open-world multiplayer mobile shooter, 50M+ downloads (</w:t>
       </w:r>
-      <w:hyperlink w:history="1" r:id="rId98k5puil9mqqdk2sykdue">
+      <w:hyperlink w:history="1" r:id="rIdkccc-owtteoelczsn0kf1">
         <w:r>
           <w:rPr>
             <w:rStyle w:val="Hyperlink"/>
@@ -1144,7 +1144,7 @@
         </w:rPr>
         <w:t xml:space="preserve">Mobile hair-salon tycoon game (</w:t>
       </w:r>
-      <w:hyperlink w:history="1" r:id="rIdnvc4vdf9gwgiqg7rezzaf">
+      <w:hyperlink w:history="1" r:id="rIdt5aalhfkca8qqc3bvb9lk">
         <w:r>
           <w:rPr>
             <w:rStyle w:val="Hyperlink"/>
@@ -1277,7 +1277,7 @@
         </w:rPr>
         <w:t xml:space="preserve">3D mobile action RPG, 1M+ downloads, 4.5+ rating (</w:t>
       </w:r>
-      <w:hyperlink w:history="1" r:id="rIdizr5_5f198ilixeapp64c">
+      <w:hyperlink w:history="1" r:id="rIdlb9k6j4eolojhw8183877">
         <w:r>
           <w:rPr>
             <w:rStyle w:val="Hyperlink"/>
@@ -1516,7 +1516,7 @@
         </w:rPr>
         <w:t xml:space="preserve">SuperSCADA, industrial SCADA suite built on Unity (</w:t>
       </w:r>
-      <w:hyperlink w:history="1" r:id="rIdfefjdcqc5vosqdvqezxi8">
+      <w:hyperlink w:history="1" r:id="rId32o_w5wmhst4-fno3jydj">
         <w:r>
           <w:rPr>
             <w:rStyle w:val="Hyperlink"/>
@@ -1554,7 +1554,7 @@
           <w:sz w:val="21"/>
           <w:szCs w:val="21"/>
         </w:rPr>
-        <w:t xml:space="preserve">Owned core architecture; the prototype won a Skolkovo innovation grant.</w:t>
+        <w:t xml:space="preserve">Proposed Unity for a new multiplatform SCADA suite and built the prototype that won a Skolkovo innovation grant.</w:t>
       </w:r>
     </w:p>
     <w:p>
@@ -1573,7 +1573,7 @@
           <w:sz w:val="21"/>
           <w:szCs w:val="21"/>
         </w:rPr>
-        <w:t xml:space="preserve">Built an IDE-style dockable, adaptive UI with node-graph and code editors for industrial controller languages (IEC 61131-3).</w:t>
+        <w:t xml:space="preserve">Built a dynamic IDE-style UI that Unity lacks out of the box: dockable, configurable panels, lists and hierarchies, plus graph and code editors for industrial controller languages (IEC 61131-3).</w:t>
       </w:r>
     </w:p>
     <w:p>

</xml_diff>